<commit_message>
Update stage 1 report
</commit_message>
<xml_diff>
--- a/第一阶段实验报告.docx
+++ b/第一阶段实验报告.docx
@@ -170,7 +170,6 @@
         </w:rPr>
         <w:t>．</w:t>
       </w:r>
-      <w:proofErr w:type="spellStart"/>
       <w:r>
         <w:rPr>
           <w:rFonts w:ascii="黑体" w:eastAsia="黑体" w:hAnsi="黑体"/>
@@ -179,27 +178,13 @@
         </w:rPr>
         <w:t>实验目标</w:t>
       </w:r>
-      <w:proofErr w:type="spellEnd"/>
     </w:p>
     <w:p>
       <w:pPr>
         <w:pStyle w:val="ListBullet"/>
       </w:pPr>
-      <w:proofErr w:type="spellStart"/>
       <w:r>
-        <w:t>使用</w:t>
-      </w:r>
-      <w:proofErr w:type="spellEnd"/>
-      <w:r>
-        <w:t xml:space="preserve"> Python 和 </w:t>
-      </w:r>
-      <w:proofErr w:type="spellStart"/>
-      <w:r>
-        <w:t>Jupyter</w:t>
-      </w:r>
-      <w:proofErr w:type="spellEnd"/>
-      <w:r>
-        <w:t xml:space="preserve"> Notebook 读取本地数据文件。</w:t>
+        <w:t>使用 Python 和 Jupyter Notebook 读取本地数据文件。</w:t>
       </w:r>
     </w:p>
     <w:p>
@@ -267,21 +252,7 @@
         <w:rPr>
           <w:lang w:eastAsia="zh-CN"/>
         </w:rPr>
-        <w:t xml:space="preserve">基于项目目标和字段名称，检查可能的目标变量 </w:t>
-      </w:r>
-      <w:proofErr w:type="spellStart"/>
-      <w:r>
-        <w:rPr>
-          <w:lang w:eastAsia="zh-CN"/>
-        </w:rPr>
-        <w:t>isDefault</w:t>
-      </w:r>
-      <w:proofErr w:type="spellEnd"/>
-      <w:r>
-        <w:rPr>
-          <w:lang w:eastAsia="zh-CN"/>
-        </w:rPr>
-        <w:t>。</w:t>
+        <w:t>基于项目目标和字段名称，检查可能的目标变量 isDefault。</w:t>
       </w:r>
     </w:p>
     <w:p>
@@ -319,7 +290,6 @@
         </w:rPr>
         <w:t>．</w:t>
       </w:r>
-      <w:proofErr w:type="spellStart"/>
       <w:r>
         <w:rPr>
           <w:rFonts w:ascii="黑体" w:eastAsia="黑体" w:hAnsi="黑体"/>
@@ -328,7 +298,6 @@
         </w:rPr>
         <w:t>使用工具</w:t>
       </w:r>
-      <w:proofErr w:type="spellEnd"/>
     </w:p>
     <w:p>
       <w:pPr>
@@ -516,7 +485,6 @@
             <w:vAlign w:val="center"/>
           </w:tcPr>
           <w:p>
-            <w:proofErr w:type="spellStart"/>
             <w:r>
               <w:rPr>
                 <w:b/>
@@ -524,7 +492,6 @@
               </w:rPr>
               <w:t>指标</w:t>
             </w:r>
-            <w:proofErr w:type="spellEnd"/>
           </w:p>
         </w:tc>
         <w:tc>
@@ -638,18 +605,8 @@
           <w:b/>
           <w:sz w:val="24"/>
         </w:rPr>
-        <w:t xml:space="preserve">2. </w:t>
+        <w:t>2. 字段类型概览</w:t>
       </w:r>
-      <w:proofErr w:type="spellStart"/>
-      <w:r>
-        <w:rPr>
-          <w:rFonts w:ascii="黑体" w:eastAsia="黑体" w:hAnsi="黑体"/>
-          <w:b/>
-          <w:sz w:val="24"/>
-        </w:rPr>
-        <w:t>字段类型概览</w:t>
-      </w:r>
-      <w:proofErr w:type="spellEnd"/>
     </w:p>
     <w:tbl>
       <w:tblPr>
@@ -1609,7 +1566,6 @@
         <w:spacing w:line="300" w:lineRule="auto"/>
         <w:ind w:firstLine="440"/>
         <w:rPr>
-          <w:rFonts w:hint="eastAsia"/>
           <w:lang w:eastAsia="zh-CN"/>
         </w:rPr>
       </w:pPr>
@@ -1617,21 +1573,7 @@
         <w:rPr>
           <w:lang w:eastAsia="zh-CN"/>
         </w:rPr>
-        <w:t>从项目目标和字段名称判断，</w:t>
-      </w:r>
-      <w:proofErr w:type="spellStart"/>
-      <w:r>
-        <w:rPr>
-          <w:lang w:eastAsia="zh-CN"/>
-        </w:rPr>
-        <w:t>isDefault</w:t>
-      </w:r>
-      <w:proofErr w:type="spellEnd"/>
-      <w:r>
-        <w:rPr>
-          <w:lang w:eastAsia="zh-CN"/>
-        </w:rPr>
-        <w:t xml:space="preserve"> 可能是本项目的目标变量。</w:t>
+        <w:t>从项目目标和字段名称判断，isDefault 可能是本项目的目标变量。</w:t>
       </w:r>
       <w:r>
         <w:rPr>
@@ -1886,7 +1828,6 @@
       <w:pPr>
         <w:spacing w:before="240" w:after="120"/>
         <w:rPr>
-          <w:rFonts w:hint="eastAsia"/>
           <w:lang w:eastAsia="zh-CN"/>
         </w:rPr>
       </w:pPr>
@@ -1907,7 +1848,6 @@
         </w:rPr>
         <w:t>．</w:t>
       </w:r>
-      <w:proofErr w:type="spellStart"/>
       <w:r>
         <w:rPr>
           <w:rFonts w:ascii="黑体" w:eastAsia="黑体" w:hAnsi="黑体"/>
@@ -1916,7 +1856,6 @@
         </w:rPr>
         <w:t>阶段性结论</w:t>
       </w:r>
-      <w:proofErr w:type="spellEnd"/>
     </w:p>
     <w:p>
       <w:pPr>
@@ -2002,19 +1941,11 @@
           <w:lang w:eastAsia="zh-CN"/>
         </w:rPr>
       </w:pPr>
-      <w:proofErr w:type="spellStart"/>
       <w:r>
         <w:rPr>
           <w:lang w:eastAsia="zh-CN"/>
         </w:rPr>
-        <w:t>isDefault</w:t>
-      </w:r>
-      <w:proofErr w:type="spellEnd"/>
-      <w:r>
-        <w:rPr>
-          <w:lang w:eastAsia="zh-CN"/>
-        </w:rPr>
-        <w:t xml:space="preserve"> 很可能是目标变量，任务类型应为二分类任务。</w:t>
+        <w:t>isDefault 很可能是目标变量，任务类型应为二分类任务。</w:t>
       </w:r>
     </w:p>
     <w:p>
@@ -2035,29 +1966,8 @@
       <w:pPr>
         <w:pStyle w:val="ListBullet"/>
       </w:pPr>
-      <w:proofErr w:type="spellStart"/>
       <w:r>
-        <w:t>缺失值主要集中在部分</w:t>
-      </w:r>
-      <w:proofErr w:type="spellEnd"/>
-      <w:r>
-        <w:t xml:space="preserve"> n </w:t>
-      </w:r>
-      <w:proofErr w:type="spellStart"/>
-      <w:r>
-        <w:t>系列字段和</w:t>
-      </w:r>
-      <w:proofErr w:type="spellEnd"/>
-      <w:r>
-        <w:t xml:space="preserve"> </w:t>
-      </w:r>
-      <w:proofErr w:type="spellStart"/>
-      <w:r>
-        <w:t>employmentLength</w:t>
-      </w:r>
-      <w:proofErr w:type="spellEnd"/>
-      <w:r>
-        <w:t xml:space="preserve"> 字段，需要在第二阶段重点处理。</w:t>
+        <w:t>缺失值主要集中在部分 n 系列字段和 employmentLength 字段，需要在第二阶段重点处理。</w:t>
       </w:r>
     </w:p>
     <w:p>
@@ -2107,7 +2017,6 @@
         </w:rPr>
         <w:t>．</w:t>
       </w:r>
-      <w:proofErr w:type="spellStart"/>
       <w:r>
         <w:rPr>
           <w:rFonts w:ascii="黑体" w:eastAsia="黑体" w:hAnsi="黑体"/>
@@ -2116,7 +2025,6 @@
         </w:rPr>
         <w:t>下一阶段计划</w:t>
       </w:r>
-      <w:proofErr w:type="spellEnd"/>
     </w:p>
     <w:p>
       <w:pPr>
@@ -2236,7 +2144,6 @@
         </w:rPr>
         <w:t>．</w:t>
       </w:r>
-      <w:proofErr w:type="spellStart"/>
       <w:r>
         <w:rPr>
           <w:rFonts w:ascii="黑体" w:eastAsia="黑体" w:hAnsi="黑体"/>
@@ -2245,22 +2152,13 @@
         </w:rPr>
         <w:t>阶段产出</w:t>
       </w:r>
-      <w:proofErr w:type="spellEnd"/>
     </w:p>
     <w:p>
       <w:pPr>
         <w:pStyle w:val="ListBullet"/>
       </w:pPr>
       <w:r>
-        <w:t>data_</w:t>
-      </w:r>
-      <w:proofErr w:type="gramStart"/>
-      <w:r>
-        <w:t>preprocessing.ipynb</w:t>
-      </w:r>
-      <w:proofErr w:type="gramEnd"/>
-      <w:r>
-        <w:t>：第一阶段代码 Notebook</w:t>
+        <w:t>data_preprocessing.ipynb：第一阶段代码 Notebook</w:t>
       </w:r>
     </w:p>
     <w:p>
@@ -2274,7 +2172,20 @@
         <w:rPr>
           <w:lang w:eastAsia="zh-CN"/>
         </w:rPr>
-        <w:t>第一阶段实验报告.docx：第一阶段实验报告</w:t>
+        <w:t>第一阶段实验报告.</w:t>
+      </w:r>
+      <w:r>
+        <w:rPr>
+          <w:rFonts w:hint="eastAsia"/>
+          <w:lang w:eastAsia="zh-CN"/>
+        </w:rPr>
+        <w:t>pdf</w:t>
+      </w:r>
+      <w:r>
+        <w:rPr>
+          <w:lang w:eastAsia="zh-CN"/>
+        </w:rPr>
+        <w:t>：第一阶段实验报告</w:t>
       </w:r>
     </w:p>
     <w:p>
@@ -2297,6 +2208,56 @@
     </w:sectPr>
   </w:body>
 </w:document>
+</file>
+
+<file path=word/endnotes.xml><?xml version="1.0" encoding="utf-8"?>
+<w:endnotes xmlns:wpc="http://schemas.microsoft.com/office/word/2010/wordprocessingCanvas" xmlns:cx="http://schemas.microsoft.com/office/drawing/2014/chartex" xmlns:cx1="http://schemas.microsoft.com/office/drawing/2015/9/8/chartex" xmlns:cx2="http://schemas.microsoft.com/office/drawing/2015/10/21/chartex" xmlns:cx3="http://schemas.microsoft.com/office/drawing/2016/5/9/chartex" xmlns:cx4="http://schemas.microsoft.com/office/drawing/2016/5/10/chartex" xmlns:cx5="http://schemas.microsoft.com/office/drawing/2016/5/11/chartex" xmlns:cx6="http://schemas.microsoft.com/office/drawing/2016/5/12/chartex" xmlns:cx7="http://schemas.microsoft.com/office/drawing/2016/5/13/chartex" xmlns:cx8="http://schemas.microsoft.com/office/drawing/2016/5/14/chartex" xmlns:mc="http://schemas.openxmlformats.org/markup-compatibility/2006" xmlns:aink="http://schemas.microsoft.com/office/drawing/2016/ink" xmlns:am3d="http://schemas.microsoft.com/office/drawing/2017/model3d" xmlns:o="urn:schemas-microsoft-com:office:office" xmlns:oel="http://schemas.microsoft.com/office/2019/extlst" xmlns:r="http://schemas.openxmlformats.org/officeDocument/2006/relationships" xmlns:m="http://schemas.openxmlformats.org/officeDocument/2006/math" xmlns:v="urn:schemas-microsoft-com:vml" xmlns:wp14="http://schemas.microsoft.com/office/word/2010/wordprocessingDrawing" xmlns:wp="http://schemas.openxmlformats.org/drawingml/2006/wordprocessingDrawing" xmlns:w10="urn:schemas-microsoft-com:office:word" xmlns:w="http://schemas.openxmlformats.org/wordprocessingml/2006/main" xmlns:w14="http://schemas.microsoft.com/office/word/2010/wordml" xmlns:w15="http://schemas.microsoft.com/office/word/2012/wordml" xmlns:w16cex="http://schemas.microsoft.com/office/word/2018/wordml/cex" xmlns:w16cid="http://schemas.microsoft.com/office/word/2016/wordml/cid" xmlns:w16="http://schemas.microsoft.com/office/word/2018/wordml" xmlns:w16du="http://schemas.microsoft.com/office/word/2023/wordml/word16du" xmlns:w16sdtdh="http://schemas.microsoft.com/office/word/2020/wordml/sdtdatahash" xmlns:w16sdtfl="http://schemas.microsoft.com/office/word/2024/wordml/sdtformatlock" xmlns:w16se="http://schemas.microsoft.com/office/word/2015/wordml/symex" xmlns:wpg="http://schemas.microsoft.com/office/word/2010/wordprocessingGroup" xmlns:wpi="http://schemas.microsoft.com/office/word/2010/wordprocessingInk" xmlns:wne="http://schemas.microsoft.com/office/word/2006/wordml" xmlns:wps="http://schemas.microsoft.com/office/word/2010/wordprocessingShape" mc:Ignorable="w14 w15 w16se w16cid w16 w16cex w16sdtdh w16sdtfl w16du wp14">
+  <w:endnote w:type="separator" w:id="-1">
+    <w:p>
+      <w:pPr>
+        <w:spacing w:after="0" w:line="240" w:lineRule="auto"/>
+      </w:pPr>
+      <w:r>
+        <w:separator/>
+      </w:r>
+    </w:p>
+  </w:endnote>
+  <w:endnote w:type="continuationSeparator" w:id="0">
+    <w:p>
+      <w:pPr>
+        <w:spacing w:after="0" w:line="240" w:lineRule="auto"/>
+      </w:pPr>
+      <w:r>
+        <w:continuationSeparator/>
+      </w:r>
+    </w:p>
+  </w:endnote>
+</w:endnotes>
+</file>
+
+<file path=word/footnotes.xml><?xml version="1.0" encoding="utf-8"?>
+<w:footnotes xmlns:wpc="http://schemas.microsoft.com/office/word/2010/wordprocessingCanvas" xmlns:cx="http://schemas.microsoft.com/office/drawing/2014/chartex" xmlns:cx1="http://schemas.microsoft.com/office/drawing/2015/9/8/chartex" xmlns:cx2="http://schemas.microsoft.com/office/drawing/2015/10/21/chartex" xmlns:cx3="http://schemas.microsoft.com/office/drawing/2016/5/9/chartex" xmlns:cx4="http://schemas.microsoft.com/office/drawing/2016/5/10/chartex" xmlns:cx5="http://schemas.microsoft.com/office/drawing/2016/5/11/chartex" xmlns:cx6="http://schemas.microsoft.com/office/drawing/2016/5/12/chartex" xmlns:cx7="http://schemas.microsoft.com/office/drawing/2016/5/13/chartex" xmlns:cx8="http://schemas.microsoft.com/office/drawing/2016/5/14/chartex" xmlns:mc="http://schemas.openxmlformats.org/markup-compatibility/2006" xmlns:aink="http://schemas.microsoft.com/office/drawing/2016/ink" xmlns:am3d="http://schemas.microsoft.com/office/drawing/2017/model3d" xmlns:o="urn:schemas-microsoft-com:office:office" xmlns:oel="http://schemas.microsoft.com/office/2019/extlst" xmlns:r="http://schemas.openxmlformats.org/officeDocument/2006/relationships" xmlns:m="http://schemas.openxmlformats.org/officeDocument/2006/math" xmlns:v="urn:schemas-microsoft-com:vml" xmlns:wp14="http://schemas.microsoft.com/office/word/2010/wordprocessingDrawing" xmlns:wp="http://schemas.openxmlformats.org/drawingml/2006/wordprocessingDrawing" xmlns:w10="urn:schemas-microsoft-com:office:word" xmlns:w="http://schemas.openxmlformats.org/wordprocessingml/2006/main" xmlns:w14="http://schemas.microsoft.com/office/word/2010/wordml" xmlns:w15="http://schemas.microsoft.com/office/word/2012/wordml" xmlns:w16cex="http://schemas.microsoft.com/office/word/2018/wordml/cex" xmlns:w16cid="http://schemas.microsoft.com/office/word/2016/wordml/cid" xmlns:w16="http://schemas.microsoft.com/office/word/2018/wordml" xmlns:w16du="http://schemas.microsoft.com/office/word/2023/wordml/word16du" xmlns:w16sdtdh="http://schemas.microsoft.com/office/word/2020/wordml/sdtdatahash" xmlns:w16sdtfl="http://schemas.microsoft.com/office/word/2024/wordml/sdtformatlock" xmlns:w16se="http://schemas.microsoft.com/office/word/2015/wordml/symex" xmlns:wpg="http://schemas.microsoft.com/office/word/2010/wordprocessingGroup" xmlns:wpi="http://schemas.microsoft.com/office/word/2010/wordprocessingInk" xmlns:wne="http://schemas.microsoft.com/office/word/2006/wordml" xmlns:wps="http://schemas.microsoft.com/office/word/2010/wordprocessingShape" mc:Ignorable="w14 w15 w16se w16cid w16 w16cex w16sdtdh w16sdtfl w16du wp14">
+  <w:footnote w:type="separator" w:id="-1">
+    <w:p>
+      <w:pPr>
+        <w:spacing w:after="0" w:line="240" w:lineRule="auto"/>
+      </w:pPr>
+      <w:r>
+        <w:separator/>
+      </w:r>
+    </w:p>
+  </w:footnote>
+  <w:footnote w:type="continuationSeparator" w:id="0">
+    <w:p>
+      <w:pPr>
+        <w:spacing w:after="0" w:line="240" w:lineRule="auto"/>
+      </w:pPr>
+      <w:r>
+        <w:continuationSeparator/>
+      </w:r>
+    </w:p>
+  </w:footnote>
+</w:footnotes>
 </file>
 
 <file path=word/numbering.xml><?xml version="1.0" encoding="utf-8"?>

</xml_diff>